<commit_message>
safe de maturite, mais pas encore simple
</commit_message>
<xml_diff>
--- a/reprex/Diff_modeles-liens.docx
+++ b/reprex/Diff_modeles-liens.docx
@@ -1,6 +1,6 @@
 
 <file path=word/document.xml><?xml version="1.0" encoding="utf-8"?>
-<w:document xmlns:wpc="http://schemas.microsoft.com/office/word/2010/wordprocessingCanvas" xmlns:cx="http://schemas.microsoft.com/office/drawing/2014/chartex" xmlns:cx1="http://schemas.microsoft.com/office/drawing/2015/9/8/chartex" xmlns:cx2="http://schemas.microsoft.com/office/drawing/2015/10/21/chartex" xmlns:cx3="http://schemas.microsoft.com/office/drawing/2016/5/9/chartex" xmlns:cx4="http://schemas.microsoft.com/office/drawing/2016/5/10/chartex" xmlns:cx5="http://schemas.microsoft.com/office/drawing/2016/5/11/chartex" xmlns:cx6="http://schemas.microsoft.com/office/drawing/2016/5/12/chartex" xmlns:cx7="http://schemas.microsoft.com/office/drawing/2016/5/13/chartex" xmlns:cx8="http://schemas.microsoft.com/office/drawing/2016/5/14/chartex" xmlns:mc="http://schemas.openxmlformats.org/markup-compatibility/2006" xmlns:aink="http://schemas.microsoft.com/office/drawing/2016/ink" xmlns:am3d="http://schemas.microsoft.com/office/drawing/2017/model3d" xmlns:o="urn:schemas-microsoft-com:office:office" xmlns:oel="http://schemas.microsoft.com/office/2019/extlst" xmlns:r="http://schemas.openxmlformats.org/officeDocument/2006/relationships" xmlns:m="http://schemas.openxmlformats.org/officeDocument/2006/math" xmlns:v="urn:schemas-microsoft-com:vml" xmlns:wp14="http://schemas.microsoft.com/office/word/2010/wordprocessingDrawing" xmlns:wp="http://schemas.openxmlformats.org/drawingml/2006/wordprocessingDrawing" xmlns:w10="urn:schemas-microsoft-com:office:word" xmlns:w="http://schemas.openxmlformats.org/wordprocessingml/2006/main" xmlns:w14="http://schemas.microsoft.com/office/word/2010/wordml" xmlns:w15="http://schemas.microsoft.com/office/word/2012/wordml" xmlns:w16cex="http://schemas.microsoft.com/office/word/2018/wordml/cex" xmlns:w16cid="http://schemas.microsoft.com/office/word/2016/wordml/cid" xmlns:w16="http://schemas.microsoft.com/office/word/2018/wordml" xmlns:w16sdtdh="http://schemas.microsoft.com/office/word/2020/wordml/sdtdatahash" xmlns:w16se="http://schemas.microsoft.com/office/word/2015/wordml/symex" xmlns:wpg="http://schemas.microsoft.com/office/word/2010/wordprocessingGroup" xmlns:wpi="http://schemas.microsoft.com/office/word/2010/wordprocessingInk" xmlns:wne="http://schemas.microsoft.com/office/word/2006/wordml" xmlns:wps="http://schemas.microsoft.com/office/word/2010/wordprocessingShape" mc:Ignorable="w14 w15 w16se w16cid w16 w16cex w16sdtdh wp14">
+<w:document xmlns:wpc="http://schemas.microsoft.com/office/word/2010/wordprocessingCanvas" xmlns:cx="http://schemas.microsoft.com/office/drawing/2014/chartex" xmlns:cx1="http://schemas.microsoft.com/office/drawing/2015/9/8/chartex" xmlns:cx2="http://schemas.microsoft.com/office/drawing/2015/10/21/chartex" xmlns:cx3="http://schemas.microsoft.com/office/drawing/2016/5/9/chartex" xmlns:cx4="http://schemas.microsoft.com/office/drawing/2016/5/10/chartex" xmlns:cx5="http://schemas.microsoft.com/office/drawing/2016/5/11/chartex" xmlns:cx6="http://schemas.microsoft.com/office/drawing/2016/5/12/chartex" xmlns:cx7="http://schemas.microsoft.com/office/drawing/2016/5/13/chartex" xmlns:cx8="http://schemas.microsoft.com/office/drawing/2016/5/14/chartex" xmlns:mc="http://schemas.openxmlformats.org/markup-compatibility/2006" xmlns:aink="http://schemas.microsoft.com/office/drawing/2016/ink" xmlns:am3d="http://schemas.microsoft.com/office/drawing/2017/model3d" xmlns:o="urn:schemas-microsoft-com:office:office" xmlns:oel="http://schemas.microsoft.com/office/2019/extlst" xmlns:r="http://schemas.openxmlformats.org/officeDocument/2006/relationships" xmlns:m="http://schemas.openxmlformats.org/officeDocument/2006/math" xmlns:v="urn:schemas-microsoft-com:vml" xmlns:wp14="http://schemas.microsoft.com/office/word/2010/wordprocessingDrawing" xmlns:wp="http://schemas.openxmlformats.org/drawingml/2006/wordprocessingDrawing" xmlns:w10="urn:schemas-microsoft-com:office:word" xmlns:w="http://schemas.openxmlformats.org/wordprocessingml/2006/main" xmlns:w14="http://schemas.microsoft.com/office/word/2010/wordml" xmlns:w15="http://schemas.microsoft.com/office/word/2012/wordml" xmlns:w16cex="http://schemas.microsoft.com/office/word/2018/wordml/cex" xmlns:w16cid="http://schemas.microsoft.com/office/word/2016/wordml/cid" xmlns:w16="http://schemas.microsoft.com/office/word/2018/wordml" xmlns:w16du="http://schemas.microsoft.com/office/word/2023/wordml/word16du" xmlns:w16sdtdh="http://schemas.microsoft.com/office/word/2020/wordml/sdtdatahash" xmlns:w16sdtfl="http://schemas.microsoft.com/office/word/2024/wordml/sdtformatlock" xmlns:w16se="http://schemas.microsoft.com/office/word/2015/wordml/symex" xmlns:wpg="http://schemas.microsoft.com/office/word/2010/wordprocessingGroup" xmlns:wpi="http://schemas.microsoft.com/office/word/2010/wordprocessingInk" xmlns:wne="http://schemas.microsoft.com/office/word/2006/wordml" xmlns:wps="http://schemas.microsoft.com/office/word/2010/wordprocessingShape" mc:Ignorable="w14 w15 w16se w16cid w16 w16cex w16sdtdh w16sdtfl w16du wp14">
   <w:body>
     <w:p>
       <w:pPr>
@@ -104,15 +104,6 @@
                 <w:szCs w:val="18"/>
               </w:rPr>
             </w:pPr>
-            <w:r>
-              <w:rPr>
-                <w:rFonts w:ascii="CIDFont+F6" w:hAnsi="CIDFont+F6" w:cs="CIDFont+F6"/>
-                <w:kern w:val="0"/>
-                <w:sz w:val="18"/>
-                <w:szCs w:val="18"/>
-              </w:rPr>
-              <w:t>b0&lt;-</w:t>
-            </w:r>
             <w:proofErr w:type="gramStart"/>
             <w:r>
               <w:rPr>
@@ -121,6 +112,26 @@
                 <w:sz w:val="18"/>
                 <w:szCs w:val="18"/>
               </w:rPr>
+              <w:t>b</w:t>
+            </w:r>
+            <w:proofErr w:type="gramEnd"/>
+            <w:r>
+              <w:rPr>
+                <w:rFonts w:ascii="CIDFont+F6" w:hAnsi="CIDFont+F6" w:cs="CIDFont+F6"/>
+                <w:kern w:val="0"/>
+                <w:sz w:val="18"/>
+                <w:szCs w:val="18"/>
+              </w:rPr>
+              <w:t>0&lt;-</w:t>
+            </w:r>
+            <w:proofErr w:type="gramStart"/>
+            <w:r>
+              <w:rPr>
+                <w:rFonts w:ascii="CIDFont+F6" w:hAnsi="CIDFont+F6" w:cs="CIDFont+F6"/>
+                <w:kern w:val="0"/>
+                <w:sz w:val="18"/>
+                <w:szCs w:val="18"/>
+              </w:rPr>
               <w:t>coef(</w:t>
             </w:r>
             <w:proofErr w:type="gramEnd"/>
@@ -135,14 +146,25 @@
             </w:r>
           </w:p>
           <w:p>
-            <w:r>
-              <w:rPr>
-                <w:rFonts w:ascii="CIDFont+F6" w:hAnsi="CIDFont+F6" w:cs="CIDFont+F6"/>
-                <w:kern w:val="0"/>
-                <w:sz w:val="18"/>
-                <w:szCs w:val="18"/>
-              </w:rPr>
-              <w:t>b1&lt;-</w:t>
+            <w:proofErr w:type="gramStart"/>
+            <w:r>
+              <w:rPr>
+                <w:rFonts w:ascii="CIDFont+F6" w:hAnsi="CIDFont+F6" w:cs="CIDFont+F6"/>
+                <w:kern w:val="0"/>
+                <w:sz w:val="18"/>
+                <w:szCs w:val="18"/>
+              </w:rPr>
+              <w:t>b</w:t>
+            </w:r>
+            <w:proofErr w:type="gramEnd"/>
+            <w:r>
+              <w:rPr>
+                <w:rFonts w:ascii="CIDFont+F6" w:hAnsi="CIDFont+F6" w:cs="CIDFont+F6"/>
+                <w:kern w:val="0"/>
+                <w:sz w:val="18"/>
+                <w:szCs w:val="18"/>
+              </w:rPr>
+              <w:t>1&lt;-</w:t>
             </w:r>
             <w:proofErr w:type="gramStart"/>
             <w:r>
@@ -572,6 +594,7 @@
               <w:t>MODELE)[["</w:t>
             </w:r>
             <w:proofErr w:type="spellStart"/>
+            <w:proofErr w:type="gramStart"/>
             <w:r>
               <w:rPr>
                 <w:rFonts w:ascii="CIDFont+F6" w:hAnsi="CIDFont+F6" w:cs="CIDFont+F6"/>
@@ -603,6 +626,7 @@
               <w:t>sexeF</w:t>
             </w:r>
             <w:proofErr w:type="spellEnd"/>
+            <w:proofErr w:type="gramEnd"/>
             <w:r>
               <w:rPr>
                 <w:rFonts w:ascii="CIDFont+F6" w:hAnsi="CIDFont+F6" w:cs="CIDFont+F6"/>
@@ -669,6 +693,7 @@
               <w:t>MODELE)[["</w:t>
             </w:r>
             <w:proofErr w:type="spellStart"/>
+            <w:proofErr w:type="gramStart"/>
             <w:r>
               <w:rPr>
                 <w:rFonts w:ascii="CIDFont+F6" w:hAnsi="CIDFont+F6" w:cs="CIDFont+F6"/>
@@ -703,6 +728,7 @@
               <w:t>sexeM</w:t>
             </w:r>
             <w:proofErr w:type="spellEnd"/>
+            <w:proofErr w:type="gramEnd"/>
             <w:r>
               <w:rPr>
                 <w:rFonts w:ascii="CIDFont+F6" w:hAnsi="CIDFont+F6" w:cs="CIDFont+F6"/>
@@ -1042,6 +1068,7 @@
               <w:t>MODELE)[["</w:t>
             </w:r>
             <w:proofErr w:type="spellStart"/>
+            <w:proofErr w:type="gramStart"/>
             <w:r>
               <w:rPr>
                 <w:rFonts w:ascii="CIDFont+F6" w:hAnsi="CIDFont+F6" w:cs="CIDFont+F6"/>
@@ -1087,6 +1114,7 @@
               <w:t>exeM</w:t>
             </w:r>
             <w:proofErr w:type="spellEnd"/>
+            <w:proofErr w:type="gramEnd"/>
             <w:r>
               <w:rPr>
                 <w:rFonts w:ascii="CIDFont+F6" w:hAnsi="CIDFont+F6" w:cs="CIDFont+F6"/>
@@ -1246,6 +1274,11 @@
             <w:tcW w:w="3827" w:type="dxa"/>
           </w:tcPr>
           <w:p>
+            <w:pPr>
+              <w:rPr>
+                <w:highlight w:val="yellow"/>
+              </w:rPr>
+            </w:pPr>
             <w:proofErr w:type="spellStart"/>
             <w:proofErr w:type="gramStart"/>
             <w:r>
@@ -1254,6 +1287,7 @@
                 <w:kern w:val="0"/>
                 <w:sz w:val="18"/>
                 <w:szCs w:val="18"/>
+                <w:highlight w:val="yellow"/>
               </w:rPr>
               <w:t>Confint</w:t>
             </w:r>
@@ -1264,6 +1298,7 @@
                 <w:kern w:val="0"/>
                 <w:sz w:val="18"/>
                 <w:szCs w:val="18"/>
+                <w:highlight w:val="yellow"/>
               </w:rPr>
               <w:t>(</w:t>
             </w:r>
@@ -1274,6 +1309,7 @@
                 <w:kern w:val="0"/>
                 <w:sz w:val="18"/>
                 <w:szCs w:val="18"/>
+                <w:highlight w:val="yellow"/>
               </w:rPr>
               <w:t>)</w:t>
             </w:r>
@@ -1284,6 +1320,11 @@
             <w:tcW w:w="3390" w:type="dxa"/>
           </w:tcPr>
           <w:p>
+            <w:pPr>
+              <w:rPr>
+                <w:highlight w:val="yellow"/>
+              </w:rPr>
+            </w:pPr>
             <w:proofErr w:type="spellStart"/>
             <w:proofErr w:type="gramStart"/>
             <w:r>
@@ -1292,6 +1333,7 @@
                 <w:kern w:val="0"/>
                 <w:sz w:val="18"/>
                 <w:szCs w:val="18"/>
+                <w:highlight w:val="yellow"/>
               </w:rPr>
               <w:t>Confint</w:t>
             </w:r>
@@ -1302,6 +1344,7 @@
                 <w:kern w:val="0"/>
                 <w:sz w:val="18"/>
                 <w:szCs w:val="18"/>
+                <w:highlight w:val="yellow"/>
               </w:rPr>
               <w:t>(</w:t>
             </w:r>
@@ -1312,6 +1355,7 @@
                 <w:kern w:val="0"/>
                 <w:sz w:val="18"/>
                 <w:szCs w:val="18"/>
+                <w:highlight w:val="yellow"/>
               </w:rPr>
               <w:t>)</w:t>
             </w:r>
@@ -3218,9 +3262,19 @@
                 <w:szCs w:val="20"/>
                 <w:lang w:val="en-CA"/>
               </w:rPr>
-              <w:t>-exp(</w:t>
-            </w:r>
-            <w:proofErr w:type="spellStart"/>
+              <w:t>-</w:t>
+            </w:r>
+            <w:proofErr w:type="gramStart"/>
+            <w:r>
+              <w:rPr>
+                <w:sz w:val="20"/>
+                <w:szCs w:val="20"/>
+                <w:lang w:val="en-CA"/>
+              </w:rPr>
+              <w:t>exp(</w:t>
+            </w:r>
+            <w:proofErr w:type="spellStart"/>
+            <w:proofErr w:type="gramEnd"/>
             <w:r>
               <w:rPr>
                 <w:sz w:val="20"/>
@@ -3325,9 +3379,19 @@
                 <w:szCs w:val="20"/>
                 <w:lang w:val="en-CA"/>
               </w:rPr>
-              <w:t>-exp(</w:t>
-            </w:r>
-            <w:proofErr w:type="spellStart"/>
+              <w:t>-</w:t>
+            </w:r>
+            <w:proofErr w:type="gramStart"/>
+            <w:r>
+              <w:rPr>
+                <w:sz w:val="20"/>
+                <w:szCs w:val="20"/>
+                <w:lang w:val="en-CA"/>
+              </w:rPr>
+              <w:t>exp(</w:t>
+            </w:r>
+            <w:proofErr w:type="spellStart"/>
+            <w:proofErr w:type="gramEnd"/>
             <w:r>
               <w:rPr>
                 <w:sz w:val="20"/>
@@ -3630,7 +3694,7 @@
 </file>
 
 <file path=word/styles.xml><?xml version="1.0" encoding="utf-8"?>
-<w:styles xmlns:mc="http://schemas.openxmlformats.org/markup-compatibility/2006" xmlns:r="http://schemas.openxmlformats.org/officeDocument/2006/relationships" xmlns:w="http://schemas.openxmlformats.org/wordprocessingml/2006/main" xmlns:w14="http://schemas.microsoft.com/office/word/2010/wordml" xmlns:w15="http://schemas.microsoft.com/office/word/2012/wordml" xmlns:w16cex="http://schemas.microsoft.com/office/word/2018/wordml/cex" xmlns:w16cid="http://schemas.microsoft.com/office/word/2016/wordml/cid" xmlns:w16="http://schemas.microsoft.com/office/word/2018/wordml" xmlns:w16sdtdh="http://schemas.microsoft.com/office/word/2020/wordml/sdtdatahash" xmlns:w16se="http://schemas.microsoft.com/office/word/2015/wordml/symex" mc:Ignorable="w14 w15 w16se w16cid w16 w16cex w16sdtdh">
+<w:styles xmlns:mc="http://schemas.openxmlformats.org/markup-compatibility/2006" xmlns:r="http://schemas.openxmlformats.org/officeDocument/2006/relationships" xmlns:w="http://schemas.openxmlformats.org/wordprocessingml/2006/main" xmlns:w14="http://schemas.microsoft.com/office/word/2010/wordml" xmlns:w15="http://schemas.microsoft.com/office/word/2012/wordml" xmlns:w16cex="http://schemas.microsoft.com/office/word/2018/wordml/cex" xmlns:w16cid="http://schemas.microsoft.com/office/word/2016/wordml/cid" xmlns:w16="http://schemas.microsoft.com/office/word/2018/wordml" xmlns:w16du="http://schemas.microsoft.com/office/word/2023/wordml/word16du" xmlns:w16sdtdh="http://schemas.microsoft.com/office/word/2020/wordml/sdtdatahash" xmlns:w16sdtfl="http://schemas.microsoft.com/office/word/2024/wordml/sdtformatlock" xmlns:w16se="http://schemas.microsoft.com/office/word/2015/wordml/symex" mc:Ignorable="w14 w15 w16se w16cid w16 w16cex w16sdtdh w16sdtfl w16du">
   <w:docDefaults>
     <w:rPrDefault>
       <w:rPr>

</xml_diff>